<commit_message>
MVP, add generic addendum
</commit_message>
<xml_diff>
--- a/docassemble/FinancialStatementShortForm/data/templates/Financial_statement_short_form_addendum.docx
+++ b/docassemble/FinancialStatementShortForm/data/templates/Financial_statement_short_form_addendum.docx
@@ -516,7 +516,7 @@
                 <w:sz w:val="20"/>
                 <w:szCs w:val="20"/>
               </w:rPr>
-              <w:t>x</w:t>
+              <w:t>Financial</w:t>
             </w:r>
             <w:proofErr w:type="gramEnd"/>
             <w:r>
@@ -525,7 +525,15 @@
                 <w:sz w:val="20"/>
                 <w:szCs w:val="20"/>
               </w:rPr>
-              <w:t>.title</w:t>
+              <w:t>_statement_short_form_attachment.</w:t>
+            </w:r>
+            <w:r>
+              <w:rPr>
+                <w:rFonts w:ascii="sans-serif" w:hAnsi="sans-serif"/>
+                <w:sz w:val="20"/>
+                <w:szCs w:val="20"/>
+              </w:rPr>
+              <w:t>title</w:t>
             </w:r>
             <w:proofErr w:type="spellEnd"/>
             <w:r>
@@ -754,14 +762,6 @@
               <w:t xml:space="preserve">{{ </w:t>
             </w:r>
             <w:proofErr w:type="spellStart"/>
-            <w:r>
-              <w:rPr>
-                <w:rFonts w:ascii="sans-serif" w:hAnsi="sans-serif"/>
-                <w:sz w:val="20"/>
-                <w:szCs w:val="20"/>
-              </w:rPr>
-              <w:t>x</w:t>
-            </w:r>
             <w:proofErr w:type="gramEnd"/>
             <w:r>
               <w:rPr>
@@ -769,7 +769,15 @@
                 <w:sz w:val="20"/>
                 <w:szCs w:val="20"/>
               </w:rPr>
-              <w:t>.title</w:t>
+              <w:t>Financial_statement_short_form_attachment.</w:t>
+            </w:r>
+            <w:r>
+              <w:rPr>
+                <w:rFonts w:ascii="sans-serif" w:hAnsi="sans-serif"/>
+                <w:sz w:val="20"/>
+                <w:szCs w:val="20"/>
+              </w:rPr>
+              <w:t>title</w:t>
             </w:r>
             <w:proofErr w:type="spellEnd"/>
             <w:r>
@@ -849,12 +857,12 @@
         <w:t xml:space="preserve">{{ </w:t>
       </w:r>
       <w:proofErr w:type="spellStart"/>
-      <w:r>
-        <w:t>x</w:t>
-      </w:r>
       <w:proofErr w:type="gramEnd"/>
       <w:r>
-        <w:t>.title</w:t>
+        <w:t>Financial_statement_short_form_attachment.</w:t>
+      </w:r>
+      <w:r>
+        <w:t>title</w:t>
       </w:r>
       <w:proofErr w:type="spellEnd"/>
       <w:r>
@@ -872,12 +880,15 @@
         <w:t xml:space="preserve">{%p for field in </w:t>
       </w:r>
       <w:proofErr w:type="spellStart"/>
+      <w:r>
+        <w:t>Financial_statement_short_form_</w:t>
+      </w:r>
       <w:proofErr w:type="gramStart"/>
       <w:r>
-        <w:t>x</w:t>
-      </w:r>
-      <w:r>
-        <w:t>.overflow</w:t>
+        <w:t>attachment.</w:t>
+      </w:r>
+      <w:r>
+        <w:t>overflow</w:t>
       </w:r>
       <w:proofErr w:type="spellEnd"/>
       <w:proofErr w:type="gramEnd"/>
@@ -1259,6 +1270,7 @@
       </w:pPr>
       <w:proofErr w:type="gramStart"/>
       <w:r>
+        <w:lastRenderedPageBreak/>
         <w:t xml:space="preserve">{{ </w:t>
       </w:r>
       <w:proofErr w:type="spellStart"/>
@@ -1328,7 +1340,6 @@
         </w:numPr>
       </w:pPr>
       <w:r>
-        <w:lastRenderedPageBreak/>
         <w:t xml:space="preserve">{%p </w:t>
       </w:r>
       <w:proofErr w:type="spellStart"/>
@@ -1390,7 +1401,13 @@
         <w:t>: {{ field.overflow_value(</w:t>
       </w:r>
       <w:r>
-        <w:t>overflow_message=x.default_overflow_message</w:t>
+        <w:t>overflow_message=</w:t>
+      </w:r>
+      <w:r>
+        <w:t>Financial_statement_short_form_attachment.</w:t>
+      </w:r>
+      <w:r>
+        <w:t>default_overflow_message</w:t>
       </w:r>
       <w:r>
         <w:t>) }}</w:t>

</xml_diff>